<commit_message>
Completed EG 01 and EG 02
</commit_message>
<xml_diff>
--- a/Labs/EG 01-Testing and SDLC - C#.docx
+++ b/Labs/EG 01-Testing and SDLC - C#.docx
@@ -6,8 +6,13 @@
       <w:pPr>
         <w:pStyle w:val="Heading1"/>
       </w:pPr>
-      <w:r>
-        <w:t>Lab  – Write Unit test specification</w:t>
+      <w:proofErr w:type="gramStart"/>
+      <w:r>
+        <w:t>Lab  –</w:t>
+      </w:r>
+      <w:proofErr w:type="gramEnd"/>
+      <w:r>
+        <w:t xml:space="preserve"> Write Unit test specification</w:t>
       </w:r>
       <w:r>
         <w:t xml:space="preserve"> (C#)</w:t>
@@ -330,9 +335,11 @@
             <w:tcW w:w="1379" w:type="dxa"/>
           </w:tcPr>
           <w:p>
+            <w:proofErr w:type="spellStart"/>
             <w:r>
               <w:t>UserService</w:t>
             </w:r>
+            <w:proofErr w:type="spellEnd"/>
           </w:p>
         </w:tc>
         <w:tc>
@@ -340,9 +347,11 @@
             <w:tcW w:w="1426" w:type="dxa"/>
           </w:tcPr>
           <w:p>
+            <w:proofErr w:type="spellStart"/>
             <w:r>
               <w:t>registerUser</w:t>
             </w:r>
+            <w:proofErr w:type="spellEnd"/>
           </w:p>
         </w:tc>
         <w:tc>
@@ -382,9 +391,11 @@
             <w:tcW w:w="1379" w:type="dxa"/>
           </w:tcPr>
           <w:p>
+            <w:proofErr w:type="spellStart"/>
             <w:r>
               <w:t>UserService</w:t>
             </w:r>
+            <w:proofErr w:type="spellEnd"/>
           </w:p>
         </w:tc>
         <w:tc>
@@ -392,9 +403,11 @@
             <w:tcW w:w="1426" w:type="dxa"/>
           </w:tcPr>
           <w:p>
+            <w:proofErr w:type="spellStart"/>
             <w:r>
               <w:t>registerUser</w:t>
             </w:r>
+            <w:proofErr w:type="spellEnd"/>
           </w:p>
         </w:tc>
         <w:tc>
@@ -413,7 +426,15 @@
           </w:tcPr>
           <w:p>
             <w:r>
-              <w:t>Throws ArgumentException with "Username already exists"</w:t>
+              <w:t xml:space="preserve">Throws </w:t>
+            </w:r>
+            <w:proofErr w:type="spellStart"/>
+            <w:r>
+              <w:t>ArgumentException</w:t>
+            </w:r>
+            <w:proofErr w:type="spellEnd"/>
+            <w:r>
+              <w:t xml:space="preserve"> with "Username already exists"</w:t>
             </w:r>
           </w:p>
         </w:tc>
@@ -441,7 +462,11 @@
         <w:t>CUT</w:t>
       </w:r>
       <w:r>
-        <w:t xml:space="preserve"> =  </w:t>
+        <w:t xml:space="preserve"> </w:t>
+      </w:r>
+      <w:proofErr w:type="gramStart"/>
+      <w:r>
+        <w:t xml:space="preserve">=  </w:t>
       </w:r>
       <w:r>
         <w:rPr>
@@ -450,7 +475,11 @@
         <w:t>C</w:t>
       </w:r>
       <w:r>
-        <w:t xml:space="preserve">lass </w:t>
+        <w:t>lass</w:t>
+      </w:r>
+      <w:proofErr w:type="gramEnd"/>
+      <w:r>
+        <w:t xml:space="preserve"> </w:t>
       </w:r>
       <w:r>
         <w:rPr>
@@ -573,8 +602,13 @@
         <w:t>C#</w:t>
       </w:r>
       <w:r>
-        <w:t xml:space="preserve"> UserService</w:t>
-      </w:r>
+        <w:t xml:space="preserve"> </w:t>
+      </w:r>
+      <w:proofErr w:type="spellStart"/>
+      <w:r>
+        <w:t>UserService</w:t>
+      </w:r>
+      <w:proofErr w:type="spellEnd"/>
     </w:p>
     <w:p>
       <w:pPr>
@@ -697,6 +731,7 @@
         </w:rPr>
         <w:t xml:space="preserve"> </w:t>
       </w:r>
+      <w:proofErr w:type="spellStart"/>
       <w:r>
         <w:rPr>
           <w:rFonts w:ascii="Consolas" w:hAnsi="Consolas" w:cs="Consolas"/>
@@ -709,6 +744,7 @@
         </w:rPr>
         <w:t>UserService</w:t>
       </w:r>
+      <w:proofErr w:type="spellEnd"/>
     </w:p>
     <w:p>
       <w:pPr>
@@ -837,8 +873,20 @@
           <w:szCs w:val="19"/>
           <w:lang w:eastAsia="en-US"/>
         </w:rPr>
-        <w:t>&lt;String, User&gt;();</w:t>
-      </w:r>
+        <w:t>&lt;String, User</w:t>
+      </w:r>
+      <w:proofErr w:type="gramStart"/>
+      <w:r>
+        <w:rPr>
+          <w:rFonts w:ascii="Consolas" w:hAnsi="Consolas" w:cs="Consolas"/>
+          <w:color w:val="000000"/>
+          <w:sz w:val="19"/>
+          <w:szCs w:val="19"/>
+          <w:lang w:eastAsia="en-US"/>
+        </w:rPr>
+        <w:t>&gt;();</w:t>
+      </w:r>
+      <w:proofErr w:type="gramEnd"/>
     </w:p>
     <w:p>
       <w:pPr>
@@ -931,6 +979,8 @@
         </w:rPr>
         <w:t xml:space="preserve"> </w:t>
       </w:r>
+      <w:proofErr w:type="spellStart"/>
+      <w:proofErr w:type="gramStart"/>
       <w:r>
         <w:rPr>
           <w:rFonts w:ascii="Consolas" w:hAnsi="Consolas" w:cs="Consolas"/>
@@ -953,7 +1003,33 @@
           <w:szCs w:val="19"/>
           <w:lang w:eastAsia="en-US"/>
         </w:rPr>
-        <w:t>egisterUser(String username, String password, String role)</w:t>
+        <w:t>egisterUser</w:t>
+      </w:r>
+      <w:proofErr w:type="spellEnd"/>
+      <w:r>
+        <w:rPr>
+          <w:rFonts w:ascii="Consolas" w:hAnsi="Consolas" w:cs="Consolas"/>
+          <w:b/>
+          <w:bCs/>
+          <w:color w:val="000000"/>
+          <w:sz w:val="19"/>
+          <w:szCs w:val="19"/>
+          <w:lang w:eastAsia="en-US"/>
+        </w:rPr>
+        <w:t>(</w:t>
+      </w:r>
+      <w:proofErr w:type="gramEnd"/>
+      <w:r>
+        <w:rPr>
+          <w:rFonts w:ascii="Consolas" w:hAnsi="Consolas" w:cs="Consolas"/>
+          <w:b/>
+          <w:bCs/>
+          <w:color w:val="000000"/>
+          <w:sz w:val="19"/>
+          <w:szCs w:val="19"/>
+          <w:lang w:eastAsia="en-US"/>
+        </w:rPr>
+        <w:t>String username, String password, String role)</w:t>
       </w:r>
     </w:p>
     <w:p>
@@ -1015,6 +1091,7 @@
         </w:rPr>
         <w:t xml:space="preserve"> throw </w:t>
       </w:r>
+      <w:proofErr w:type="spellStart"/>
       <w:r>
         <w:rPr>
           <w:rFonts w:ascii="Consolas" w:hAnsi="Consolas" w:cs="Consolas"/>
@@ -1023,7 +1100,18 @@
           <w:szCs w:val="19"/>
           <w:lang w:eastAsia="en-US"/>
         </w:rPr>
-        <w:t xml:space="preserve">IllegalArgumentException </w:t>
+        <w:t>IllegalArgumentException</w:t>
+      </w:r>
+      <w:proofErr w:type="spellEnd"/>
+      <w:r>
+        <w:rPr>
+          <w:rFonts w:ascii="Consolas" w:hAnsi="Consolas" w:cs="Consolas"/>
+          <w:color w:val="77206D" w:themeColor="accent5" w:themeShade="BF"/>
+          <w:sz w:val="19"/>
+          <w:szCs w:val="19"/>
+          <w:lang w:eastAsia="en-US"/>
+        </w:rPr>
+        <w:t xml:space="preserve"> </w:t>
       </w:r>
       <w:r>
         <w:rPr>
@@ -1059,8 +1147,9 @@
           <w:szCs w:val="19"/>
           <w:lang w:eastAsia="en-US"/>
         </w:rPr>
-        <w:t xml:space="preserve"> //  </w:t>
-      </w:r>
+        <w:t xml:space="preserve"> /</w:t>
+      </w:r>
+      <w:proofErr w:type="gramStart"/>
       <w:r>
         <w:rPr>
           <w:rFonts w:ascii="Consolas" w:hAnsi="Consolas" w:cs="Consolas"/>
@@ -1069,8 +1158,19 @@
           <w:szCs w:val="19"/>
           <w:lang w:eastAsia="en-US"/>
         </w:rPr>
+        <w:t xml:space="preserve">/  </w:t>
+      </w:r>
+      <w:r>
+        <w:rPr>
+          <w:rFonts w:ascii="Consolas" w:hAnsi="Consolas" w:cs="Consolas"/>
+          <w:color w:val="77206D" w:themeColor="accent5" w:themeShade="BF"/>
+          <w:sz w:val="19"/>
+          <w:szCs w:val="19"/>
+          <w:lang w:eastAsia="en-US"/>
+        </w:rPr>
         <w:tab/>
       </w:r>
+      <w:proofErr w:type="gramEnd"/>
       <w:r>
         <w:rPr>
           <w:rFonts w:ascii="Consolas" w:hAnsi="Consolas" w:cs="Consolas"/>
@@ -1293,7 +1393,29 @@
           <w:szCs w:val="19"/>
           <w:lang w:eastAsia="en-US"/>
         </w:rPr>
-        <w:t>must contain one of these special characters !@#$%^&amp;*</w:t>
+        <w:t xml:space="preserve">must contain one of these special </w:t>
+      </w:r>
+      <w:proofErr w:type="gramStart"/>
+      <w:r>
+        <w:rPr>
+          <w:rFonts w:ascii="Consolas" w:hAnsi="Consolas" w:cs="Consolas"/>
+          <w:color w:val="3A7C22" w:themeColor="accent6" w:themeShade="BF"/>
+          <w:sz w:val="19"/>
+          <w:szCs w:val="19"/>
+          <w:lang w:eastAsia="en-US"/>
+        </w:rPr>
+        <w:t>characters !</w:t>
+      </w:r>
+      <w:proofErr w:type="gramEnd"/>
+      <w:r>
+        <w:rPr>
+          <w:rFonts w:ascii="Consolas" w:hAnsi="Consolas" w:cs="Consolas"/>
+          <w:color w:val="3A7C22" w:themeColor="accent6" w:themeShade="BF"/>
+          <w:sz w:val="19"/>
+          <w:szCs w:val="19"/>
+          <w:lang w:eastAsia="en-US"/>
+        </w:rPr>
+        <w:t>@#$%^&amp;*</w:t>
       </w:r>
     </w:p>
     <w:p>
@@ -1425,6 +1547,8 @@
         </w:rPr>
         <w:tab/>
       </w:r>
+      <w:proofErr w:type="spellStart"/>
+      <w:proofErr w:type="gramStart"/>
       <w:r>
         <w:rPr>
           <w:rFonts w:ascii="Consolas" w:hAnsi="Consolas" w:cs="Consolas"/>
@@ -1449,6 +1573,8 @@
         </w:rPr>
         <w:t>Add</w:t>
       </w:r>
+      <w:proofErr w:type="spellEnd"/>
+      <w:proofErr w:type="gramEnd"/>
       <w:r>
         <w:rPr>
           <w:rFonts w:ascii="Consolas" w:hAnsi="Consolas" w:cs="Consolas"/>
@@ -1483,8 +1609,48 @@
           <w:szCs w:val="19"/>
           <w:lang w:eastAsia="en-US"/>
         </w:rPr>
-        <w:t xml:space="preserve"> User(username, password, role));</w:t>
-      </w:r>
+        <w:t xml:space="preserve"> </w:t>
+      </w:r>
+      <w:proofErr w:type="gramStart"/>
+      <w:r>
+        <w:rPr>
+          <w:rFonts w:ascii="Consolas" w:hAnsi="Consolas" w:cs="Consolas"/>
+          <w:b/>
+          <w:bCs/>
+          <w:color w:val="000000"/>
+          <w:sz w:val="19"/>
+          <w:szCs w:val="19"/>
+          <w:lang w:eastAsia="en-US"/>
+        </w:rPr>
+        <w:t>User(</w:t>
+      </w:r>
+      <w:proofErr w:type="gramEnd"/>
+      <w:r>
+        <w:rPr>
+          <w:rFonts w:ascii="Consolas" w:hAnsi="Consolas" w:cs="Consolas"/>
+          <w:b/>
+          <w:bCs/>
+          <w:color w:val="000000"/>
+          <w:sz w:val="19"/>
+          <w:szCs w:val="19"/>
+          <w:lang w:eastAsia="en-US"/>
+        </w:rPr>
+        <w:t>username, password, role)</w:t>
+      </w:r>
+      <w:proofErr w:type="gramStart"/>
+      <w:r>
+        <w:rPr>
+          <w:rFonts w:ascii="Consolas" w:hAnsi="Consolas" w:cs="Consolas"/>
+          <w:b/>
+          <w:bCs/>
+          <w:color w:val="000000"/>
+          <w:sz w:val="19"/>
+          <w:szCs w:val="19"/>
+          <w:lang w:eastAsia="en-US"/>
+        </w:rPr>
+        <w:t>);</w:t>
+      </w:r>
+      <w:proofErr w:type="gramEnd"/>
     </w:p>
     <w:p>
       <w:pPr>
@@ -1648,6 +1814,8 @@
         </w:rPr>
         <w:t xml:space="preserve"> bool </w:t>
       </w:r>
+      <w:proofErr w:type="spellStart"/>
+      <w:proofErr w:type="gramStart"/>
       <w:r>
         <w:rPr>
           <w:rFonts w:ascii="Consolas" w:hAnsi="Consolas" w:cs="Consolas"/>
@@ -1670,8 +1838,22 @@
           <w:szCs w:val="19"/>
           <w:lang w:eastAsia="en-US"/>
         </w:rPr>
-        <w:t>oginUser(</w:t>
-      </w:r>
+        <w:t>oginUser</w:t>
+      </w:r>
+      <w:proofErr w:type="spellEnd"/>
+      <w:r>
+        <w:rPr>
+          <w:rFonts w:ascii="Consolas" w:hAnsi="Consolas" w:cs="Consolas"/>
+          <w:b/>
+          <w:bCs/>
+          <w:color w:val="000000"/>
+          <w:sz w:val="19"/>
+          <w:szCs w:val="19"/>
+          <w:lang w:eastAsia="en-US"/>
+        </w:rPr>
+        <w:t>(</w:t>
+      </w:r>
+      <w:proofErr w:type="gramEnd"/>
       <w:r>
         <w:rPr>
           <w:rFonts w:ascii="Consolas" w:hAnsi="Consolas" w:cs="Consolas"/>
@@ -1783,6 +1965,7 @@
         </w:rPr>
         <w:t xml:space="preserve"> throw </w:t>
       </w:r>
+      <w:proofErr w:type="spellStart"/>
       <w:r>
         <w:rPr>
           <w:rFonts w:ascii="Consolas" w:hAnsi="Consolas" w:cs="Consolas"/>
@@ -1791,7 +1974,18 @@
           <w:szCs w:val="19"/>
           <w:lang w:eastAsia="en-US"/>
         </w:rPr>
-        <w:t xml:space="preserve">ArgumentException </w:t>
+        <w:t>ArgumentException</w:t>
+      </w:r>
+      <w:proofErr w:type="spellEnd"/>
+      <w:r>
+        <w:rPr>
+          <w:rFonts w:ascii="Consolas" w:hAnsi="Consolas" w:cs="Consolas"/>
+          <w:color w:val="77206D" w:themeColor="accent5" w:themeShade="BF"/>
+          <w:sz w:val="19"/>
+          <w:szCs w:val="19"/>
+          <w:lang w:eastAsia="en-US"/>
+        </w:rPr>
+        <w:t xml:space="preserve"> </w:t>
       </w:r>
       <w:r>
         <w:rPr>
@@ -1827,8 +2021,9 @@
           <w:szCs w:val="19"/>
           <w:lang w:eastAsia="en-US"/>
         </w:rPr>
-        <w:t xml:space="preserve">//  </w:t>
-      </w:r>
+        <w:t>/</w:t>
+      </w:r>
+      <w:proofErr w:type="gramStart"/>
       <w:r>
         <w:rPr>
           <w:rFonts w:ascii="Consolas" w:hAnsi="Consolas" w:cs="Consolas"/>
@@ -1837,8 +2032,19 @@
           <w:szCs w:val="19"/>
           <w:lang w:eastAsia="en-US"/>
         </w:rPr>
+        <w:t xml:space="preserve">/  </w:t>
+      </w:r>
+      <w:r>
+        <w:rPr>
+          <w:rFonts w:ascii="Consolas" w:hAnsi="Consolas" w:cs="Consolas"/>
+          <w:color w:val="77206D" w:themeColor="accent5" w:themeShade="BF"/>
+          <w:sz w:val="19"/>
+          <w:szCs w:val="19"/>
+          <w:lang w:eastAsia="en-US"/>
+        </w:rPr>
         <w:tab/>
       </w:r>
+      <w:proofErr w:type="gramEnd"/>
       <w:r>
         <w:rPr>
           <w:rFonts w:ascii="Consolas" w:hAnsi="Consolas" w:cs="Consolas"/>
@@ -1893,8 +2099,9 @@
           <w:szCs w:val="19"/>
           <w:lang w:eastAsia="en-US"/>
         </w:rPr>
-        <w:t xml:space="preserve">//  </w:t>
-      </w:r>
+        <w:t>/</w:t>
+      </w:r>
+      <w:proofErr w:type="gramStart"/>
       <w:r>
         <w:rPr>
           <w:rFonts w:ascii="Consolas" w:hAnsi="Consolas" w:cs="Consolas"/>
@@ -1903,8 +2110,19 @@
           <w:szCs w:val="19"/>
           <w:lang w:eastAsia="en-US"/>
         </w:rPr>
+        <w:t xml:space="preserve">/  </w:t>
+      </w:r>
+      <w:r>
+        <w:rPr>
+          <w:rFonts w:ascii="Consolas" w:hAnsi="Consolas" w:cs="Consolas"/>
+          <w:color w:val="77206D" w:themeColor="accent5" w:themeShade="BF"/>
+          <w:sz w:val="19"/>
+          <w:szCs w:val="19"/>
+          <w:lang w:eastAsia="en-US"/>
+        </w:rPr>
         <w:tab/>
       </w:r>
+      <w:proofErr w:type="gramEnd"/>
       <w:r>
         <w:rPr>
           <w:rFonts w:ascii="Consolas" w:hAnsi="Consolas" w:cs="Consolas"/>
@@ -1969,7 +2187,18 @@
           <w:szCs w:val="19"/>
           <w:lang w:eastAsia="en-US"/>
         </w:rPr>
-        <w:t xml:space="preserve">//  </w:t>
+        <w:t>/</w:t>
+      </w:r>
+      <w:proofErr w:type="gramStart"/>
+      <w:r>
+        <w:rPr>
+          <w:rFonts w:ascii="Consolas" w:hAnsi="Consolas" w:cs="Consolas"/>
+          <w:color w:val="3A7C22" w:themeColor="accent6" w:themeShade="BF"/>
+          <w:sz w:val="19"/>
+          <w:szCs w:val="19"/>
+          <w:lang w:eastAsia="en-US"/>
+        </w:rPr>
+        <w:t xml:space="preserve">/  </w:t>
       </w:r>
       <w:r>
         <w:rPr>
@@ -1980,6 +2209,16 @@
           <w:lang w:eastAsia="en-US"/>
         </w:rPr>
         <w:tab/>
+      </w:r>
+      <w:proofErr w:type="gramEnd"/>
+      <w:r>
+        <w:rPr>
+          <w:rFonts w:ascii="Consolas" w:hAnsi="Consolas" w:cs="Consolas"/>
+          <w:color w:val="3A7C22" w:themeColor="accent6" w:themeShade="BF"/>
+          <w:sz w:val="19"/>
+          <w:szCs w:val="19"/>
+          <w:lang w:eastAsia="en-US"/>
+        </w:rPr>
         <w:t>if user is not registered</w:t>
       </w:r>
     </w:p>
@@ -2168,6 +2407,8 @@
         </w:rPr>
         <w:t xml:space="preserve"> bool </w:t>
       </w:r>
+      <w:proofErr w:type="spellStart"/>
+      <w:proofErr w:type="gramStart"/>
       <w:r>
         <w:rPr>
           <w:rFonts w:ascii="Consolas" w:hAnsi="Consolas" w:cs="Consolas"/>
@@ -2190,8 +2431,22 @@
           <w:szCs w:val="19"/>
           <w:lang w:eastAsia="en-US"/>
         </w:rPr>
-        <w:t>asAccess(</w:t>
-      </w:r>
+        <w:t>asAccess</w:t>
+      </w:r>
+      <w:proofErr w:type="spellEnd"/>
+      <w:r>
+        <w:rPr>
+          <w:rFonts w:ascii="Consolas" w:hAnsi="Consolas" w:cs="Consolas"/>
+          <w:b/>
+          <w:bCs/>
+          <w:color w:val="000000"/>
+          <w:sz w:val="19"/>
+          <w:szCs w:val="19"/>
+          <w:lang w:eastAsia="en-US"/>
+        </w:rPr>
+        <w:t>(</w:t>
+      </w:r>
+      <w:proofErr w:type="gramEnd"/>
       <w:r>
         <w:rPr>
           <w:rFonts w:ascii="Consolas" w:hAnsi="Consolas" w:cs="Consolas"/>
@@ -2238,7 +2493,33 @@
           <w:szCs w:val="19"/>
           <w:lang w:eastAsia="en-US"/>
         </w:rPr>
-        <w:t>tring requiredRole)</w:t>
+        <w:t xml:space="preserve">tring </w:t>
+      </w:r>
+      <w:proofErr w:type="spellStart"/>
+      <w:r>
+        <w:rPr>
+          <w:rFonts w:ascii="Consolas" w:hAnsi="Consolas" w:cs="Consolas"/>
+          <w:b/>
+          <w:bCs/>
+          <w:color w:val="000000"/>
+          <w:sz w:val="19"/>
+          <w:szCs w:val="19"/>
+          <w:lang w:eastAsia="en-US"/>
+        </w:rPr>
+        <w:t>requiredRole</w:t>
+      </w:r>
+      <w:proofErr w:type="spellEnd"/>
+      <w:r>
+        <w:rPr>
+          <w:rFonts w:ascii="Consolas" w:hAnsi="Consolas" w:cs="Consolas"/>
+          <w:b/>
+          <w:bCs/>
+          <w:color w:val="000000"/>
+          <w:sz w:val="19"/>
+          <w:szCs w:val="19"/>
+          <w:lang w:eastAsia="en-US"/>
+        </w:rPr>
+        <w:t>)</w:t>
       </w:r>
     </w:p>
     <w:p>
@@ -2300,6 +2581,7 @@
         </w:rPr>
         <w:t xml:space="preserve">// throw </w:t>
       </w:r>
+      <w:proofErr w:type="spellStart"/>
       <w:r>
         <w:rPr>
           <w:rFonts w:ascii="Consolas" w:hAnsi="Consolas" w:cs="Consolas"/>
@@ -2308,7 +2590,18 @@
           <w:szCs w:val="19"/>
           <w:lang w:eastAsia="en-US"/>
         </w:rPr>
-        <w:t xml:space="preserve">ArgumentException </w:t>
+        <w:t>ArgumentException</w:t>
+      </w:r>
+      <w:proofErr w:type="spellEnd"/>
+      <w:r>
+        <w:rPr>
+          <w:rFonts w:ascii="Consolas" w:hAnsi="Consolas" w:cs="Consolas"/>
+          <w:color w:val="77206D" w:themeColor="accent5" w:themeShade="BF"/>
+          <w:sz w:val="19"/>
+          <w:szCs w:val="19"/>
+          <w:lang w:eastAsia="en-US"/>
+        </w:rPr>
+        <w:t xml:space="preserve"> </w:t>
       </w:r>
       <w:r>
         <w:rPr>
@@ -2346,8 +2639,20 @@
           <w:szCs w:val="19"/>
           <w:lang w:eastAsia="en-US"/>
         </w:rPr>
-        <w:t xml:space="preserve"> // return true if the user’s role matches the requiredRole</w:t>
-      </w:r>
+        <w:t xml:space="preserve"> // return true if the user’s role matches the </w:t>
+      </w:r>
+      <w:proofErr w:type="spellStart"/>
+      <w:r>
+        <w:rPr>
+          <w:rFonts w:ascii="Consolas" w:hAnsi="Consolas" w:cs="Consolas"/>
+          <w:color w:val="3A7C22" w:themeColor="accent6" w:themeShade="BF"/>
+          <w:sz w:val="19"/>
+          <w:szCs w:val="19"/>
+          <w:lang w:eastAsia="en-US"/>
+        </w:rPr>
+        <w:t>requiredRole</w:t>
+      </w:r>
+      <w:proofErr w:type="spellEnd"/>
     </w:p>
     <w:p>
       <w:pPr>
@@ -2657,7 +2962,29 @@
           <w:szCs w:val="19"/>
           <w:lang w:eastAsia="en-US"/>
         </w:rPr>
-        <w:t xml:space="preserve"> { get; </w:t>
+        <w:t xml:space="preserve"> </w:t>
+      </w:r>
+      <w:proofErr w:type="gramStart"/>
+      <w:r>
+        <w:rPr>
+          <w:rFonts w:ascii="Consolas" w:hAnsi="Consolas" w:cs="Consolas"/>
+          <w:color w:val="000000"/>
+          <w:sz w:val="19"/>
+          <w:szCs w:val="19"/>
+          <w:lang w:eastAsia="en-US"/>
+        </w:rPr>
+        <w:t>{ get</w:t>
+      </w:r>
+      <w:proofErr w:type="gramEnd"/>
+      <w:r>
+        <w:rPr>
+          <w:rFonts w:ascii="Consolas" w:hAnsi="Consolas" w:cs="Consolas"/>
+          <w:color w:val="000000"/>
+          <w:sz w:val="19"/>
+          <w:szCs w:val="19"/>
+          <w:lang w:eastAsia="en-US"/>
+        </w:rPr>
+        <w:t xml:space="preserve">; </w:t>
       </w:r>
       <w:r>
         <w:rPr>
@@ -2677,8 +3004,20 @@
           <w:szCs w:val="19"/>
           <w:lang w:eastAsia="en-US"/>
         </w:rPr>
-        <w:t xml:space="preserve"> set; }</w:t>
-      </w:r>
+        <w:t xml:space="preserve"> set</w:t>
+      </w:r>
+      <w:proofErr w:type="gramStart"/>
+      <w:r>
+        <w:rPr>
+          <w:rFonts w:ascii="Consolas" w:hAnsi="Consolas" w:cs="Consolas"/>
+          <w:color w:val="000000"/>
+          <w:sz w:val="19"/>
+          <w:szCs w:val="19"/>
+          <w:lang w:eastAsia="en-US"/>
+        </w:rPr>
+        <w:t>; }</w:t>
+      </w:r>
+      <w:proofErr w:type="gramEnd"/>
     </w:p>
     <w:p>
       <w:pPr>
@@ -2764,7 +3103,29 @@
           <w:szCs w:val="19"/>
           <w:lang w:eastAsia="en-US"/>
         </w:rPr>
-        <w:t xml:space="preserve"> { get; </w:t>
+        <w:t xml:space="preserve"> </w:t>
+      </w:r>
+      <w:proofErr w:type="gramStart"/>
+      <w:r>
+        <w:rPr>
+          <w:rFonts w:ascii="Consolas" w:hAnsi="Consolas" w:cs="Consolas"/>
+          <w:color w:val="000000"/>
+          <w:sz w:val="19"/>
+          <w:szCs w:val="19"/>
+          <w:lang w:eastAsia="en-US"/>
+        </w:rPr>
+        <w:t>{ get</w:t>
+      </w:r>
+      <w:proofErr w:type="gramEnd"/>
+      <w:r>
+        <w:rPr>
+          <w:rFonts w:ascii="Consolas" w:hAnsi="Consolas" w:cs="Consolas"/>
+          <w:color w:val="000000"/>
+          <w:sz w:val="19"/>
+          <w:szCs w:val="19"/>
+          <w:lang w:eastAsia="en-US"/>
+        </w:rPr>
+        <w:t xml:space="preserve">; </w:t>
       </w:r>
       <w:r>
         <w:rPr>
@@ -2784,8 +3145,20 @@
           <w:szCs w:val="19"/>
           <w:lang w:eastAsia="en-US"/>
         </w:rPr>
-        <w:t xml:space="preserve"> set; }</w:t>
-      </w:r>
+        <w:t xml:space="preserve"> set</w:t>
+      </w:r>
+      <w:proofErr w:type="gramStart"/>
+      <w:r>
+        <w:rPr>
+          <w:rFonts w:ascii="Consolas" w:hAnsi="Consolas" w:cs="Consolas"/>
+          <w:color w:val="000000"/>
+          <w:sz w:val="19"/>
+          <w:szCs w:val="19"/>
+          <w:lang w:eastAsia="en-US"/>
+        </w:rPr>
+        <w:t>; }</w:t>
+      </w:r>
+      <w:proofErr w:type="gramEnd"/>
     </w:p>
     <w:p>
       <w:pPr>
@@ -2871,7 +3244,29 @@
           <w:szCs w:val="19"/>
           <w:lang w:eastAsia="en-US"/>
         </w:rPr>
-        <w:t xml:space="preserve"> { get; </w:t>
+        <w:t xml:space="preserve"> </w:t>
+      </w:r>
+      <w:proofErr w:type="gramStart"/>
+      <w:r>
+        <w:rPr>
+          <w:rFonts w:ascii="Consolas" w:hAnsi="Consolas" w:cs="Consolas"/>
+          <w:color w:val="000000"/>
+          <w:sz w:val="19"/>
+          <w:szCs w:val="19"/>
+          <w:lang w:eastAsia="en-US"/>
+        </w:rPr>
+        <w:t>{ get</w:t>
+      </w:r>
+      <w:proofErr w:type="gramEnd"/>
+      <w:r>
+        <w:rPr>
+          <w:rFonts w:ascii="Consolas" w:hAnsi="Consolas" w:cs="Consolas"/>
+          <w:color w:val="000000"/>
+          <w:sz w:val="19"/>
+          <w:szCs w:val="19"/>
+          <w:lang w:eastAsia="en-US"/>
+        </w:rPr>
+        <w:t xml:space="preserve">; </w:t>
       </w:r>
       <w:r>
         <w:rPr>
@@ -2891,8 +3286,20 @@
           <w:szCs w:val="19"/>
           <w:lang w:eastAsia="en-US"/>
         </w:rPr>
-        <w:t xml:space="preserve"> set; }</w:t>
-      </w:r>
+        <w:t xml:space="preserve"> set</w:t>
+      </w:r>
+      <w:proofErr w:type="gramStart"/>
+      <w:r>
+        <w:rPr>
+          <w:rFonts w:ascii="Consolas" w:hAnsi="Consolas" w:cs="Consolas"/>
+          <w:color w:val="000000"/>
+          <w:sz w:val="19"/>
+          <w:szCs w:val="19"/>
+          <w:lang w:eastAsia="en-US"/>
+        </w:rPr>
+        <w:t>; }</w:t>
+      </w:r>
+      <w:proofErr w:type="gramEnd"/>
     </w:p>
     <w:p>
       <w:pPr>
@@ -2961,7 +3368,33 @@
           <w:szCs w:val="19"/>
           <w:lang w:eastAsia="en-US"/>
         </w:rPr>
-        <w:t xml:space="preserve"> User(String username, String password, String role)</w:t>
+        <w:t xml:space="preserve"> </w:t>
+      </w:r>
+      <w:proofErr w:type="gramStart"/>
+      <w:r>
+        <w:rPr>
+          <w:rFonts w:ascii="Consolas" w:hAnsi="Consolas" w:cs="Consolas"/>
+          <w:b/>
+          <w:bCs/>
+          <w:color w:val="000000"/>
+          <w:sz w:val="19"/>
+          <w:szCs w:val="19"/>
+          <w:lang w:eastAsia="en-US"/>
+        </w:rPr>
+        <w:t>User(</w:t>
+      </w:r>
+      <w:proofErr w:type="gramEnd"/>
+      <w:r>
+        <w:rPr>
+          <w:rFonts w:ascii="Consolas" w:hAnsi="Consolas" w:cs="Consolas"/>
+          <w:b/>
+          <w:bCs/>
+          <w:color w:val="000000"/>
+          <w:sz w:val="19"/>
+          <w:szCs w:val="19"/>
+          <w:lang w:eastAsia="en-US"/>
+        </w:rPr>
+        <w:t>String username, String password, String role)</w:t>
       </w:r>
     </w:p>
     <w:p>
@@ -3035,8 +3468,20 @@
           <w:szCs w:val="19"/>
           <w:lang w:eastAsia="en-US"/>
         </w:rPr>
-        <w:t>. Username = username;</w:t>
-      </w:r>
+        <w:t xml:space="preserve">. Username = </w:t>
+      </w:r>
+      <w:proofErr w:type="gramStart"/>
+      <w:r>
+        <w:rPr>
+          <w:rFonts w:ascii="Consolas" w:hAnsi="Consolas" w:cs="Consolas"/>
+          <w:color w:val="000000"/>
+          <w:sz w:val="19"/>
+          <w:szCs w:val="19"/>
+          <w:lang w:eastAsia="en-US"/>
+        </w:rPr>
+        <w:t>username;</w:t>
+      </w:r>
+      <w:proofErr w:type="gramEnd"/>
     </w:p>
     <w:p>
       <w:pPr>
@@ -3082,8 +3527,20 @@
           <w:szCs w:val="19"/>
           <w:lang w:eastAsia="en-US"/>
         </w:rPr>
-        <w:t>. Password = password;</w:t>
-      </w:r>
+        <w:t xml:space="preserve">. Password = </w:t>
+      </w:r>
+      <w:proofErr w:type="gramStart"/>
+      <w:r>
+        <w:rPr>
+          <w:rFonts w:ascii="Consolas" w:hAnsi="Consolas" w:cs="Consolas"/>
+          <w:color w:val="000000"/>
+          <w:sz w:val="19"/>
+          <w:szCs w:val="19"/>
+          <w:lang w:eastAsia="en-US"/>
+        </w:rPr>
+        <w:t>password;</w:t>
+      </w:r>
+      <w:proofErr w:type="gramEnd"/>
     </w:p>
     <w:p>
       <w:pPr>
@@ -3129,8 +3586,20 @@
           <w:szCs w:val="19"/>
           <w:lang w:eastAsia="en-US"/>
         </w:rPr>
-        <w:t>. Role = role;</w:t>
-      </w:r>
+        <w:t xml:space="preserve">. Role = </w:t>
+      </w:r>
+      <w:proofErr w:type="gramStart"/>
+      <w:r>
+        <w:rPr>
+          <w:rFonts w:ascii="Consolas" w:hAnsi="Consolas" w:cs="Consolas"/>
+          <w:color w:val="000000"/>
+          <w:sz w:val="19"/>
+          <w:szCs w:val="19"/>
+          <w:lang w:eastAsia="en-US"/>
+        </w:rPr>
+        <w:t>role;</w:t>
+      </w:r>
+      <w:proofErr w:type="gramEnd"/>
     </w:p>
     <w:p>
       <w:pPr>

</xml_diff>